<commit_message>
OutSystems: figuren ook in reader + echt ingebed in downloads
Twee gaten gedicht die na publicatie aan het licht kwamen:
- Alle 40 figuren stonden alleen in de slidedeck-tab, nooit in de
  reader (de brontekst had er geen [FIGUUR]-markers voor). Elk figuur
  op de inhoudelijk juiste plek in de bijbehorende reader.md ingevoegd
  (deel 26/29 bewust overgeslagen, geen figuren in die delen).
- De .docx/.pptx-downloads bevatten tot nu toe letterlijk de tekst
  "[FIGUUR x-y]" i.p.v. de afbeelding. Alle 40 SVG's gerasterized naar
  PNG (via headless Chromium, geen SVG-rasterizer op deze machine) en
  ingebed in reader.docx en slidedeck.pptx — inclusief een fix voor
  figuren die in een TABLE- of STATEMENT-slide staan (werden voorheen
  stilzwijgend overgeslagen in de pptx-builder).

Alle 30 delen (HTML, docx, pptx) opnieuw gegenereerd. 90 docx + 30
pptx gecontroleerd op corruptie (0 gevonden), 0 resterende
placeholders.
</commit_message>
<xml_diff>
--- a/outsystems/niveau-1/deel-01/reader.docx
+++ b/outsystems/niveau-1/deel-01/reader.docx
@@ -88,6 +88,58 @@
       </w:r>
       <w:r>
         <w:t>, een app waarmee HR-medewerkers bij werkgevers verzuim van deelnemers doorgeven aan Meridiaan. Je bouwt hem in dit niveau tweemaal — eenmaal in O11, eenmaal in ODC — om vanaf dag één te voelen wat hetzelfde is en wat niet.</w:t>
+      </w:r>
+    </w:p>
+    <w:p>
+      <w:pPr>
+        <w:jc w:val="center"/>
+      </w:pPr>
+      <w:r>
+        <w:drawing>
+          <wp:inline xmlns:a="http://schemas.openxmlformats.org/drawingml/2006/main" xmlns:pic="http://schemas.openxmlformats.org/drawingml/2006/picture">
+            <wp:extent cx="5580000" cy="2869714"/>
+            <wp:docPr id="1" name="Picture 1"/>
+            <wp:cNvGraphicFramePr>
+              <a:graphicFrameLocks noChangeAspect="1"/>
+            </wp:cNvGraphicFramePr>
+            <a:graphic>
+              <a:graphicData uri="http://schemas.openxmlformats.org/drawingml/2006/picture">
+                <pic:pic>
+                  <pic:nvPicPr>
+                    <pic:cNvPr id="0" name="figuur-1-1.png"/>
+                    <pic:cNvPicPr/>
+                  </pic:nvPicPr>
+                  <pic:blipFill>
+                    <a:blip r:embed="rId9"/>
+                    <a:stretch>
+                      <a:fillRect/>
+                    </a:stretch>
+                  </pic:blipFill>
+                  <pic:spPr>
+                    <a:xfrm>
+                      <a:off x="0" y="0"/>
+                      <a:ext cx="5580000" cy="2869714"/>
+                    </a:xfrm>
+                    <a:prstGeom prst="rect"/>
+                  </pic:spPr>
+                </pic:pic>
+              </a:graphicData>
+            </a:graphic>
+          </wp:inline>
+        </w:drawing>
+      </w:r>
+    </w:p>
+    <w:p>
+      <w:pPr>
+        <w:jc w:val="center"/>
+      </w:pPr>
+      <w:r>
+        <w:rPr>
+          <w:i/>
+          <w:color w:val="55606F"/>
+          <w:sz w:val="18"/>
+        </w:rPr>
+        <w:t>Figuur 1-1 — Meridiaan-landschap — Mutatieplatform, Mutatie-API, WGP + satellieten, positie van deze cursus</w:t>
       </w:r>
     </w:p>
     <w:p>
@@ -390,6 +442,58 @@
     <w:p>
       <w:r>
         <w:t>Beide platformen delen de onderliggende visuele taal — entities, logica, schermen — maar verschillen in tooling, deploymentmodel en een aantal platformcapaciteiten (BPT bestaat bijvoorbeeld niet in ODC, zie deel 18). Vanaf deel 2 lopen beide sporen naast elkaar door de hele cursus.</w:t>
+      </w:r>
+    </w:p>
+    <w:p>
+      <w:pPr>
+        <w:jc w:val="center"/>
+      </w:pPr>
+      <w:r>
+        <w:drawing>
+          <wp:inline xmlns:a="http://schemas.openxmlformats.org/drawingml/2006/main" xmlns:pic="http://schemas.openxmlformats.org/drawingml/2006/picture">
+            <wp:extent cx="5580000" cy="2869714"/>
+            <wp:docPr id="2" name="Picture 2"/>
+            <wp:cNvGraphicFramePr>
+              <a:graphicFrameLocks noChangeAspect="1"/>
+            </wp:cNvGraphicFramePr>
+            <a:graphic>
+              <a:graphicData uri="http://schemas.openxmlformats.org/drawingml/2006/picture">
+                <pic:pic>
+                  <pic:nvPicPr>
+                    <pic:cNvPr id="0" name="figuur-1-2.png"/>
+                    <pic:cNvPicPr/>
+                  </pic:nvPicPr>
+                  <pic:blipFill>
+                    <a:blip r:embed="rId10"/>
+                    <a:stretch>
+                      <a:fillRect/>
+                    </a:stretch>
+                  </pic:blipFill>
+                  <pic:spPr>
+                    <a:xfrm>
+                      <a:off x="0" y="0"/>
+                      <a:ext cx="5580000" cy="2869714"/>
+                    </a:xfrm>
+                    <a:prstGeom prst="rect"/>
+                  </pic:spPr>
+                </pic:pic>
+              </a:graphicData>
+            </a:graphic>
+          </wp:inline>
+        </w:drawing>
+      </w:r>
+    </w:p>
+    <w:p>
+      <w:pPr>
+        <w:jc w:val="center"/>
+      </w:pPr>
+      <w:r>
+        <w:rPr>
+          <w:i/>
+          <w:color w:val="55606F"/>
+          <w:sz w:val="18"/>
+        </w:rPr>
+        <w:t>Figuur 1-2 — Schematische vergelijking O11-stack vs ODC-stack</w:t>
       </w:r>
     </w:p>
     <w:p>

</xml_diff>